<commit_message>
Add Group 3 Week 4 project document
</commit_message>
<xml_diff>
--- a/Capstone_Project/00_Project_Administration/Group-3_Ethical_Clearance_Confirmation.docx
+++ b/Capstone_Project/00_Project_Administration/Group-3_Ethical_Clearance_Confirmation.docx
@@ -206,7 +206,7 @@
           <w:p>
             <w:r>
               <w:rPr/>
-              <w:t>Week 4 before the survey and user testing</w:t>
+              <w:t>Week 4</w:t>
             </w:r>
           </w:p>
         </w:tc>
@@ -233,7 +233,7 @@
           <w:p>
             <w:r>
               <w:rPr/>
-              <w:t>Thursday 22 October 2026</w:t>
+              <w:t>Friday 23 October 2026</w:t>
             </w:r>
           </w:p>
         </w:tc>
@@ -524,7 +524,7 @@
               <w:rPr>
                 <w:sz w:val="19"/>
               </w:rPr>
-              <w:t>Anonymous survey of at least 8 CTU students with no names or student numbers</w:t>
+              <w:t>Anonymous student survey done on 22 October 2026 and answered by 13 CTU students with no names or student numbers</w:t>
             </w:r>
           </w:p>
         </w:tc>
@@ -577,7 +577,7 @@
               <w:rPr>
                 <w:sz w:val="19"/>
               </w:rPr>
-              <w:t>At least 5 students and 1 lecturer with a short questionnaire</w:t>
+              <w:t>At least 5 students and 1 or 2 lecturers in Week 5 with a short questionnaire</w:t>
             </w:r>
           </w:p>
         </w:tc>
@@ -680,7 +680,7 @@
       </w:pPr>
       <w:r>
         <w:rPr/>
-        <w:t>Human participant data is needed for the survey and user testing so the group asks for supervisor approval before either starts</w:t>
+        <w:t>Human participant data was collected in the anonymous student survey (13 answers) and will be collected again in the user testing in Week 5 so the group asks the supervisor to confirm approval for the user testing before it starts</w:t>
       </w:r>
     </w:p>
     <w:p>

</xml_diff>

<commit_message>
Final submission: dissertation, slides, user testing results and updated documents
</commit_message>
<xml_diff>
--- a/Capstone_Project/00_Project_Administration/Group-3_Ethical_Clearance_Confirmation.docx
+++ b/Capstone_Project/00_Project_Administration/Group-3_Ethical_Clearance_Confirmation.docx
@@ -577,7 +577,7 @@
               <w:rPr>
                 <w:sz w:val="19"/>
               </w:rPr>
-              <w:t>At least 5 students and 1 lecturer in Week 5 with a short questionnaire</w:t>
+              <w:t xml:space="preserve">4 students and 2 lecturers on 28 October with a short anonymous Google Form</w:t>
             </w:r>
           </w:p>
         </w:tc>
@@ -680,7 +680,11 @@
       </w:pPr>
       <w:r>
         <w:rPr/>
-        <w:t>Human participant data was collected in the anonymous student survey (13 answers) and will be collected again in the user testing in Week 5 so the group asks the supervisor to confirm approval for the user testing before it starts</w:t>
+        <w:t xml:space="preserve">Human participant data was collected in the anonymous student survey (13 answers) </w:t>
+      </w:r>
+      <w:r>
+        <w:rPr/>
+        <w:t xml:space="preserve">and again in the user testing on 28 October (4 students and 2 lecturers) and the supervisor approved both before they started</w:t>
       </w:r>
     </w:p>
     <w:p>

</xml_diff>

<commit_message>
Final submission: peer confirmations, fixed covers, defect log and walkthrough video
</commit_message>
<xml_diff>
--- a/Capstone_Project/00_Project_Administration/Group-3_Ethical_Clearance_Confirmation.docx
+++ b/Capstone_Project/00_Project_Administration/Group-3_Ethical_Clearance_Confirmation.docx
@@ -37,7 +37,6 @@
       </w:r>
       <w:r>
         <w:br/>
-        <w:t>Student / Group Template</w:t>
       </w:r>
       <w:r>
         <w:br/>
@@ -206,7 +205,7 @@
           <w:p>
             <w:r>
               <w:rPr/>
-              <w:t>Week 4</w:t>
+              <w:t>Week 5 Final submission</w:t>
             </w:r>
           </w:p>
         </w:tc>
@@ -233,7 +232,7 @@
           <w:p>
             <w:r>
               <w:rPr/>
-              <w:t>Friday 23 October 2026</w:t>
+              <w:t>Thursday 29 October 2026</w:t>
             </w:r>
           </w:p>
         </w:tc>

</xml_diff>